<commit_message>
Use direct quotations where possible in Sections 3.1-3.2
Co-Authored-By: Claude Opus 5.5 <noreply@anthropic.com>
Claude-Session: https://claude.ai/code/session_01D75XZCNXPUXwLshn5jBJpA
</commit_message>
<xml_diff>
--- a/thesis/第3章_3.1_3.2.docx
+++ b/thesis/第3章_3.1_3.2.docx
@@ -69,7 +69,7 @@
           <w:b w:val="0"/>
           <w:sz w:val="24"/>
         </w:rPr>
-        <w:t>米国の宅配便は長い歴史をもち、最大手のUPSは1907年に一般家庭へメッセージや小荷物を届けるサービスを開始した（齊藤，2016，p.58）。齊藤（2016，p.56）によれば、日本で宅配便が生み出された時点ですでに発達していた米国の宅配便は、日本の宅配便誕生のビジネスモデルとなった。</w:t>
+        <w:t>米国の宅配便は長い歴史をもつ。最大手のUPSについて、齊藤（2016，p.58）は、「1907年に一般家庭にメッセージや小荷物を届けるサービスを開始したUPSであるが、100年以上を経てアメリカだけでなく世界へ輸送ネットワークを持つ巨大な宅配便事業者へと成長を遂げている」と述べている。また齊藤（2016，p.56）は、「アメリカの宅配便は、日本の宅配便誕生のビジネスモデルとなった」と指摘している。</w:t>
       </w:r>
     </w:p>
     <w:p>
@@ -83,7 +83,7 @@
           <w:b w:val="0"/>
           <w:sz w:val="24"/>
         </w:rPr>
-        <w:t>米国の宅配便は、通常150ポンド（68kg）以下の小型貨物を対象とし、トラックで輸送する陸上宅配便と、幹線輸送に航空機を用いる航空宅配便とに分かれる（齊藤，2016，pp.56-57）。国土が広いため、陸上宅配便は配送に1〜5営業日を要し、日本のように多くの地域に翌日配達することは困難である（齊藤，2016，p.57）。</w:t>
+        <w:t>米国の宅配便が対象とする貨物は、「通常150ポンド（68kg）以下の小型貨物で、１個単位から事業所や家庭に配達される」（齊藤，2016，p.56）。輸送には、トラックによる陸上宅配便と、幹線輸送に航空機を用いる航空宅配便がある（齊藤，2016，pp.56-57）。陸上宅配便は「配送日数が１営業日から５営業日を要して配送される」とされ、「日本のように多くの地域に翌日配達することは困難」である（齊藤，2016，p.57）。</w:t>
       </w:r>
     </w:p>
     <w:p>
@@ -97,7 +97,7 @@
           <w:b w:val="0"/>
           <w:sz w:val="24"/>
         </w:rPr>
-        <w:t>市場構造をみると、2008年のリーマンショック後にDHLが米国内の宅配便から撤退して以降、寡占化が一段と進んだ（齊藤，2016，p.61）。2014年の大手3社の国内宅配便営業収入の構成比は、UPSが49％、FedExが32％、USPSが19％であり、民間の大手2社だけで約8割を占めている（齊藤，2016，p.61）。</w:t>
+        <w:t>市場構造をみると、DHLが2008年のリーマンショック後に米国内の宅配便から撤退し、「以降アメリカの国内宅配便市場は一段と寡占化の度合いが強まっていった」（齊藤，2016，p.61）。2014年の大手3社の国内宅配便営業収入の構成比は、UPSが49％、FedExが32％、USPSが19％であり、「民間企業の大手宅配便事業者だけで、国内宅配便の８割を占めるようになって」いる（齊藤，2016，p.61）。</w:t>
       </w:r>
     </w:p>
     <w:p>
@@ -125,7 +125,7 @@
           <w:b w:val="0"/>
           <w:sz w:val="24"/>
         </w:rPr>
-        <w:t>2010年代に入ると、ネット通販の急拡大を背景に宅配便市場は急速に拡大した。大手3社の国内宅配便の営業収入は、2010年の562億ドルから2014年には726億ドルに増加している（齊藤，2016，p.57）。UPSでは、ネット通販によるB2Cの宅配便が国内宅配便全体の45％を占めるに至った（齊藤，2016，p.58）。</w:t>
+        <w:t>2010年代に入ると、ネット通販の急拡大を背景に宅配便市場は急速に拡大した。齊藤（2016，p.57）によれば、「2010年の３社の国内宅配便の営業収入は562億ドルであったが、2014年には726億ドルに増加している」。UPSでは、ネット通販によるB2Cの宅配便が「国内宅配便全体の45％を占めるようになっている」（齊藤，2016，p.58）。</w:t>
       </w:r>
     </w:p>
     <w:p>
@@ -139,7 +139,21 @@
           <w:b w:val="0"/>
           <w:sz w:val="24"/>
         </w:rPr>
-        <w:t>こうした中で、寡占化した大手宅配便事業者は運賃支配力を強めた。UPSとFedExは、家庭配送追加料金や燃油追加料金などの追加料金を個別に値上げするとともに、2015年からは陸上宅配便にも容積重量価格を導入し、軽くてかさばるネット通販の貨物の運賃上昇をもたらした（齊藤，2016，pp.61-62）。このような継続的な運賃の値上げは、ネット通販事業者の物流コストを押し上げている（齊藤，2016，p.62）。Amazonにおいても、売上高に占める輸送コストの比率は2017年に12.2％に上昇した（齊藤，2021，p.53）。さらに2013年のクリスマスシーズンには、UPSが急増した貨物に対応できず、大規模な遅配が発生した（齊藤，2022，pp.45-46）。</w:t>
+        <w:t>こうした中で、寡占化した大手宅配便事業者は、「事業の収益性を強化するために運賃支配力を強めており、その結果、宅配便運賃の値上げが継続的に行われた」（齊藤，2016，p.61）。具体的には、家庭配送追加料金や燃油追加料金などの追加料金が個別に値上げされたほか、「UPSとFedExは、共に2015年初頭から取扱量の最も多い陸上宅配便に対して、この容積重量価格の運賃制度を導入した」（齊藤，2016，pp.61-62）。齊藤（2016，p.62）は、「こうした継続的な宅配便の運賃値上げは、急激に拡大を図っているネット通販の物流コストの上昇をもたらし」ていると指摘している。</w:t>
+      </w:r>
+    </w:p>
+    <w:p>
+      <w:pPr>
+        <w:spacing w:lineRule="exact" w:line="360"/>
+        <w:ind w:firstLine="240"/>
+      </w:pPr>
+      <w:r>
+        <w:rPr>
+          <w:rFonts w:ascii="Century" w:hAnsi="Century" w:eastAsia="ＭＳ 明朝"/>
+          <w:b w:val="0"/>
+          <w:sz w:val="24"/>
+        </w:rPr>
+        <w:t>Amazonにおいても、「売上高に対する輸送コスト比率では2010年代初めに8％台であったものが上昇を続けており、2017年には12.2％に増加している」（齊藤，2021，p.53）。さらに、「2013年のクリスマスシーズンに急増したアマゾンのネット通販貨物に大手宅配便事業者のUPSが対応できず、アマゾンが販売した大量の商品がクリスマスまでに届かないという大規模な遅配が発生した」（齊藤，2022，pp.45-46）。</w:t>
       </w:r>
     </w:p>
     <w:p>
@@ -181,7 +195,7 @@
           <w:b w:val="0"/>
           <w:sz w:val="24"/>
         </w:rPr>
-        <w:t>日本の宅配便は、1970年代前半のオイルショック以降のトラック輸送市場の変化を背景に誕生した。佐藤（1988，p.267）によれば、重厚長大型産業の停滞や軽薄短小型産業の活発化、サービス経済化による貨物の多品種少量化のもとで、従来のトラック運送業のあり方は変革を迫られ、その一つとして生まれたのが宅配便であった。1976年にヤマト運輸が「宅急便」を開始し（佐藤，1988，p.269）、その後、1977年には日本通運と西濃運輸、1981年には日本運送と福山通運などの大手トラック企業が相次いで宅配便市場に参入した（佐藤，1988，p.274）。</w:t>
+        <w:t>佐藤（1988，p.267）は、「新しい物流システムの一形態である宅配便が誕生した背景には，1970年代前半のいわゆるオイルショック以降におけるトラック輸送市場の変化がある」と述べ、トラック運送業が変革を迫られるなかで、「その一つが宅配便であり，ヤマト運輸（株）の『宅急便』が開発の先べんをつけた」としている。1976年にヤマト運輸が「宅急便」を開始した後（佐藤，1988，p.269）、「1977年に日本通運(株)と西濃運輸(株)，1981年には日本運送(株)や福山通運(株)など大手トラック企業が次々と宅配便市場へ参入した」（佐藤，1988，p.274）。</w:t>
       </w:r>
     </w:p>
     <w:p>
@@ -195,7 +209,7 @@
           <w:b w:val="0"/>
           <w:sz w:val="24"/>
         </w:rPr>
-        <w:t>宅急便は、米屋や酒屋、コンビニエンスストアなどを取次店とする制度によって出荷の利便性を高め（佐藤，1988，p.275）、1986年には全国的なネットワークを確立した（佐藤，1988，p.273）。その取扱個数は、1981年に鉄道小荷物を、1983年には郵便小包を上回った（佐藤，1988，p.277）。なお、宅配便の大枠は、1983年に運輸省が認可した「宅配便運賃」によって確定したとされる（佐藤，1988，p.268）。</w:t>
+        <w:t>宅急便は、取次店の制度によって出荷の利便性を高めた。取次店とは、「『宅急便』貨物の集荷所となる契約を結んだ一般の米屋とか酒屋，コンビニエンスストアなどのことである」（佐藤，1988，p.275）。そして、「1986年の段階には，島しょや北海道の一部を除いて全国的ネットワークの確立をみた」（佐藤，1988，p.273）。その間、「『宅急便』の取扱個数は，1981年に鉄道小荷物を，そして1983年には郵便小包を上回り，その後も急増している」（佐藤，1988，p.277）。なお、佐藤（1988，p.268）によれば、「宅配便の定義に関しては，1983年に運輸省が認可した『宅配便運賃』によってその大枠が確定した」。</w:t>
       </w:r>
     </w:p>
     <w:p>
@@ -223,7 +237,21 @@
           <w:b w:val="0"/>
           <w:sz w:val="24"/>
         </w:rPr>
-        <w:t>国土交通省（2025）の添付資料によれば、宅配便の取扱個数は、1985年度の約4億9,300万個から増加を続け、2024年度には50億3,147万個に達した。2024年度のトラック運送による宅配便のシェアは、ヤマト運輸の「宅急便」が47.2％、佐川急便の「飛脚宅配便」が25.8％、日本郵便の「ゆうパック」が22.2％であり、上位3便で約95.2％を占めている（国土交通省，2025）。このように、日本の宅配便市場も、少数の大手事業者による寡占構造となっている。齊藤（2016，p.61）も、大手宅配便事業者2社と郵便事業者の3社が市場の大部分を占める点で、米国の宅配便の市場構造は日本と極めて類似していると指摘している。</w:t>
+        <w:t>国土交通省（2025）の添付資料によれば、宅配便の取扱個数は、1985年度の約4億9,300万個から増加を続けてきた。2024年度については、「令和６年度の宅配便取扱個数は、50億3147万個であった」（国土交通省，2025）。トラック運送による宅配便のシェアは、ヤマト運輸の「宅急便」が47.2％、佐川急便の「飛脚宅配便」が25.8％、日本郵便の「ゆうパック」が22.2％であり（国土交通省，2025）、「『宅急便』、『飛脚宅配便』及び『ゆうパック』の上位３便で約95.2%を占めている」（国土交通省，2025）。</w:t>
+      </w:r>
+    </w:p>
+    <w:p>
+      <w:pPr>
+        <w:spacing w:lineRule="exact" w:line="360"/>
+        <w:ind w:firstLine="240"/>
+      </w:pPr>
+      <w:r>
+        <w:rPr>
+          <w:rFonts w:ascii="Century" w:hAnsi="Century" w:eastAsia="ＭＳ 明朝"/>
+          <w:b w:val="0"/>
+          <w:sz w:val="24"/>
+        </w:rPr>
+        <w:t>このように、日本の宅配便市場も少数の大手事業者による寡占構造となっている。齊藤（2016，p.61）も、米国について「２社の大手宅配便事業者と郵便事業者の３社が市場の大部分を占めて寡占化しており、この点では宅配便の市場構造が日本と極めて類似している」と述べている。ただし同時に、「宅配便事業者の運賃支配力に関しては、日本と大きく異なっている」とも指摘している（齊藤，2016，p.61）。</w:t>
       </w:r>
     </w:p>
     <w:p>
@@ -251,7 +279,7 @@
           <w:b w:val="0"/>
           <w:sz w:val="24"/>
         </w:rPr>
-        <w:t>しかし、ネット通販の急増とドライバー不足を背景に、2010年代には宅配危機が深刻化した（林，2020，p.9）。2013年には佐川急便が採算性の低い大口のネット通販の契約を見直し（林，2020，pp.9-10）、2017年にはヤマト運輸が荷受量の総量規制や一部サービスの停止を行うとともに、アマゾンジャパンに対しても40％の運賃値上げを実施した（齊藤，2022，p.56）。</w:t>
+        <w:t>日本では、2010年代に宅配危機が深刻化した。林（2020，p.9）は、「ネット通販の急成長によって宅配需要が急増する一方、働き方改革が必要とされ、2017年頃から宅配危機が深刻化した」と述べている。それに先立ち、「佐川急便は、2013年に取扱量拡大から収益性重視に転じ、採算性の低い大口ネット通販契約を見直した」（林，2020，pp.9-10）。さらに2017年には、ヤマト運輸が「ネット通販貨物向けの一部輸送サービスの停止や、輸送サービスそのものの供給を制限する総量規制を実施した」（齊藤，2022，p.56）。アマゾンジャパンとの関係では、「ヤマト運輸はアマゾンとも運賃交渉を行い、その結果40％もの運賃値上げが実施されることになった」（齊藤，2022，p.56）。</w:t>
       </w:r>
     </w:p>
     <w:p>
@@ -265,7 +293,7 @@
           <w:b w:val="0"/>
           <w:sz w:val="24"/>
         </w:rPr>
-        <w:t>このように、日米の宅配市場は、少数の大手事業者による寡占構造という点で共通している。しかし、米国では寡占化した大手事業者による運賃支配力の強化が、日本ではドライバー不足を背景とする引受量の抑制と運賃の値上げが、それぞれネット通販事業者にとっての課題となったといえる。</w:t>
+        <w:t>このように、日米の宅配市場は、少数の大手事業者による寡占構造という点で共通している。しかし、米国では寡占化した大手事業者による運賃支配力の強化が、日本ではドライバー不足や働き方改革を背景とする引受量の抑制と運賃の値上げが、それぞれネット通販事業者にとっての課題となったといえる。</w:t>
       </w:r>
     </w:p>
     <w:sectPr>

</xml_diff>

<commit_message>
Refine quotations in Sections 3.1-3.2 to full sentences or summaries
Co-Authored-By: Claude Opus 5.5 <noreply@anthropic.com>
Claude-Session: https://claude.ai/code/session_01D75XZCNXPUXwLshn5jBJpA
</commit_message>
<xml_diff>
--- a/thesis/第3章_3.1_3.2.docx
+++ b/thesis/第3章_3.1_3.2.docx
@@ -83,7 +83,7 @@
           <w:b w:val="0"/>
           <w:sz w:val="24"/>
         </w:rPr>
-        <w:t>米国の宅配便が対象とする貨物は、「通常150ポンド（68kg）以下の小型貨物で、１個単位から事業所や家庭に配達される」（齊藤，2016，p.56）。輸送には、トラックによる陸上宅配便と、幹線輸送に航空機を用いる航空宅配便がある（齊藤，2016，pp.56-57）。陸上宅配便は「配送日数が１営業日から５営業日を要して配送される」とされ、「日本のように多くの地域に翌日配達することは困難」である（齊藤，2016，p.57）。</w:t>
+        <w:t>米国の宅配便が対象とする貨物は、「通常150ポンド（68kg）以下の小型貨物で、１個単位から事業所や家庭に配達される」（齊藤，2016，p.56）。輸送には、トラックによる陸上宅配便と、幹線輸送に航空機を用いる航空宅配便がある（齊藤，2016，pp.56-57）。陸上宅配便について、齊藤（2016，p.57）は、「陸上宅配便は、配送日数が１営業日から５営業日を要して配送される。アメリカでは国土が広いために、トラックによる陸上宅配便は、多くの輸送日数が必要となる。日本のように多くの地域に翌日配達することは困難であり、アメリカの陸上宅配便は、運賃は低いものの、輸送日数が多くかかる」と述べている。</w:t>
       </w:r>
     </w:p>
     <w:p>
@@ -97,7 +97,7 @@
           <w:b w:val="0"/>
           <w:sz w:val="24"/>
         </w:rPr>
-        <w:t>市場構造をみると、DHLが2008年のリーマンショック後に米国内の宅配便から撤退し、「以降アメリカの国内宅配便市場は一段と寡占化の度合いが強まっていった」（齊藤，2016，p.61）。2014年の大手3社の国内宅配便営業収入の構成比は、UPSが49％、FedExが32％、USPSが19％であり、「民間企業の大手宅配便事業者だけで、国内宅配便の８割を占めるようになって」いる（齊藤，2016，p.61）。</w:t>
+        <w:t>市場構造をみると、齊藤（2016，p.61）は、DHLが2008年のリーマンショック後に米国内の宅配便から撤退したことを挙げ、「以降アメリカの国内宅配便市場は一段と寡占化の度合いが強まっていった」と述べている。2014年の大手3社の国内宅配便営業収入の構成比は、UPSが49％、FedExが32％、USPSが19％であり、民間の大手2社だけで国内宅配便の約8割を占めている（齊藤，2016，p.61）。</w:t>
       </w:r>
     </w:p>
     <w:p>
@@ -139,7 +139,7 @@
           <w:b w:val="0"/>
           <w:sz w:val="24"/>
         </w:rPr>
-        <w:t>こうした中で、寡占化した大手宅配便事業者は、「事業の収益性を強化するために運賃支配力を強めており、その結果、宅配便運賃の値上げが継続的に行われた」（齊藤，2016，p.61）。具体的には、家庭配送追加料金や燃油追加料金などの追加料金が個別に値上げされたほか、「UPSとFedExは、共に2015年初頭から取扱量の最も多い陸上宅配便に対して、この容積重量価格の運賃制度を導入した」（齊藤，2016，pp.61-62）。齊藤（2016，p.62）は、「こうした継続的な宅配便の運賃値上げは、急激に拡大を図っているネット通販の物流コストの上昇をもたらし」ていると指摘している。</w:t>
+        <w:t>こうした中で、齊藤（2016，p.61）は、「寡占化が進行する中で、UPSとFedExの大手宅配便事業者は、事業の収益性を強化するために運賃支配力を強めており、その結果、宅配便運賃の値上げが継続的に行われた」と述べている。具体的には、家庭配送追加料金や燃油追加料金などの追加料金が個別に値上げされたほか、2015年からは取扱量の最も多い陸上宅配便にも、容積と重量を比較して運賃を決める容積重量価格の運賃制度が導入された（齊藤，2016，pp.61-62）。この制度について齊藤（2016，p.62）は、「これによって、とりわけネット通販の宅配便運賃の上昇が避けられない状況が発生している」と述べている。そして、「こうした継続的な宅配便の運賃値上げは、急激に拡大を図っているネット通販の物流コストの上昇をもたらし当該ビジネスに大きな影響を与えており、それによってネット通販事業者の新たな対応が必要となっている」と指摘している（齊藤，2016，p.62）。</w:t>
       </w:r>
     </w:p>
     <w:p>
@@ -209,7 +209,7 @@
           <w:b w:val="0"/>
           <w:sz w:val="24"/>
         </w:rPr>
-        <w:t>宅急便は、取次店の制度によって出荷の利便性を高めた。取次店とは、「『宅急便』貨物の集荷所となる契約を結んだ一般の米屋とか酒屋，コンビニエンスストアなどのことである」（佐藤，1988，p.275）。そして、「1986年の段階には，島しょや北海道の一部を除いて全国的ネットワークの確立をみた」（佐藤，1988，p.273）。その間、「『宅急便』の取扱個数は，1981年に鉄道小荷物を，そして1983年には郵便小包を上回り，その後も急増している」（佐藤，1988，p.277）。なお、佐藤（1988，p.268）によれば、「宅配便の定義に関しては，1983年に運輸省が認可した『宅配便運賃』によってその大枠が確定した」。</w:t>
+        <w:t>宅急便は、取次店の制度によって出荷の利便性を高めた。取次店とは、「『宅急便』貨物の集荷所となる契約を結んだ一般の米屋とか酒屋，コンビニエンスストアなどのことである」（佐藤，1988，p.275）。そして、1985年の沖縄県進出によって全都道府県に進出し、1986年には島しょや北海道の一部を除いて全国的なネットワークを確立した（佐藤，1988，p.273）。その間、「『宅急便』の取扱個数は，1981年に鉄道小荷物を，そして1983年には郵便小包を上回り，その後も急増している」（佐藤，1988，p.277）。なお、佐藤（1988，p.268）によれば、「宅配便の定義に関しては，1983年に運輸省が認可した『宅配便運賃』によってその大枠が確定した」。</w:t>
       </w:r>
     </w:p>
     <w:p>

</xml_diff>

<commit_message>
Rebalance Sections 3.1-3.2: summaries with key direct quotations
Co-Authored-By: Claude Opus 5.5 <noreply@anthropic.com>
Claude-Session: https://claude.ai/code/session_01D75XZCNXPUXwLshn5jBJpA
</commit_message>
<xml_diff>
--- a/thesis/第3章_3.1_3.2.docx
+++ b/thesis/第3章_3.1_3.2.docx
@@ -69,7 +69,7 @@
           <w:b w:val="0"/>
           <w:sz w:val="24"/>
         </w:rPr>
-        <w:t>米国の宅配便は長い歴史をもつ。最大手のUPSについて、齊藤（2016，p.58）は、「1907年に一般家庭にメッセージや小荷物を届けるサービスを開始したUPSであるが、100年以上を経てアメリカだけでなく世界へ輸送ネットワークを持つ巨大な宅配便事業者へと成長を遂げている」と述べている。また齊藤（2016，p.56）は、「アメリカの宅配便は、日本の宅配便誕生のビジネスモデルとなった」と指摘している。</w:t>
+        <w:t>米国の宅配便は長い歴史をもち、最大手のUPSは1907年に一般家庭へメッセージや小荷物を届けるサービスを開始した（齊藤，2016，p.58）。齊藤（2016，p.56）は、「アメリカの宅配便は、日本の宅配便誕生のビジネスモデルとなった」と述べている。</w:t>
       </w:r>
     </w:p>
     <w:p>
@@ -83,7 +83,7 @@
           <w:b w:val="0"/>
           <w:sz w:val="24"/>
         </w:rPr>
-        <w:t>米国の宅配便が対象とする貨物は、「通常150ポンド（68kg）以下の小型貨物で、１個単位から事業所や家庭に配達される」（齊藤，2016，p.56）。輸送には、トラックによる陸上宅配便と、幹線輸送に航空機を用いる航空宅配便がある（齊藤，2016，pp.56-57）。陸上宅配便について、齊藤（2016，p.57）は、「陸上宅配便は、配送日数が１営業日から５営業日を要して配送される。アメリカでは国土が広いために、トラックによる陸上宅配便は、多くの輸送日数が必要となる。日本のように多くの地域に翌日配達することは困難であり、アメリカの陸上宅配便は、運賃は低いものの、輸送日数が多くかかる」と述べている。</w:t>
+        <w:t>米国の宅配便は、通常150ポンド（68kg）以下の小型貨物を対象とし、トラックで輸送する陸上宅配便と、幹線輸送に航空機を用いる航空宅配便とに分かれる（齊藤，2016，pp.56-57）。国土が広いため、陸上宅配便は配送に1〜5営業日を要し、日本のように多くの地域に翌日配達することは難しい（齊藤，2016，p.57）。</w:t>
       </w:r>
     </w:p>
     <w:p>
@@ -97,7 +97,7 @@
           <w:b w:val="0"/>
           <w:sz w:val="24"/>
         </w:rPr>
-        <w:t>市場構造をみると、齊藤（2016，p.61）は、DHLが2008年のリーマンショック後に米国内の宅配便から撤退したことを挙げ、「以降アメリカの国内宅配便市場は一段と寡占化の度合いが強まっていった」と述べている。2014年の大手3社の国内宅配便営業収入の構成比は、UPSが49％、FedExが32％、USPSが19％であり、民間の大手2社だけで国内宅配便の約8割を占めている（齊藤，2016，p.61）。</w:t>
+        <w:t>市場構造をみると、2008年のリーマンショック後にDHLが米国内の宅配便から撤退して以降、寡占化が一段と進んだ（齊藤，2016，p.61）。2014年の大手3社の国内宅配便営業収入の構成比は、UPSが49％、FedExが32％、USPSが19％であり、民間の大手2社だけで約8割を占めている（齊藤，2016，p.61）。</w:t>
       </w:r>
     </w:p>
     <w:p>
@@ -125,7 +125,7 @@
           <w:b w:val="0"/>
           <w:sz w:val="24"/>
         </w:rPr>
-        <w:t>2010年代に入ると、ネット通販の急拡大を背景に宅配便市場は急速に拡大した。齊藤（2016，p.57）によれば、「2010年の３社の国内宅配便の営業収入は562億ドルであったが、2014年には726億ドルに増加している」。UPSでは、ネット通販によるB2Cの宅配便が「国内宅配便全体の45％を占めるようになっている」（齊藤，2016，p.58）。</w:t>
+        <w:t>2010年代に入ると、ネット通販の急拡大を背景に宅配便市場は急速に拡大した。大手3社の国内宅配便の営業収入は、2010年の562億ドルから2014年には726億ドルに増加している（齊藤，2016，p.57）。UPSでは、ネット通販によるB2Cの宅配便が国内宅配便全体の45％を占めるに至った（齊藤，2016，p.58）。</w:t>
       </w:r>
     </w:p>
     <w:p>
@@ -139,21 +139,7 @@
           <w:b w:val="0"/>
           <w:sz w:val="24"/>
         </w:rPr>
-        <w:t>こうした中で、齊藤（2016，p.61）は、「寡占化が進行する中で、UPSとFedExの大手宅配便事業者は、事業の収益性を強化するために運賃支配力を強めており、その結果、宅配便運賃の値上げが継続的に行われた」と述べている。具体的には、家庭配送追加料金や燃油追加料金などの追加料金が個別に値上げされたほか、2015年からは取扱量の最も多い陸上宅配便にも、容積と重量を比較して運賃を決める容積重量価格の運賃制度が導入された（齊藤，2016，pp.61-62）。この制度について齊藤（2016，p.62）は、「これによって、とりわけネット通販の宅配便運賃の上昇が避けられない状況が発生している」と述べている。そして、「こうした継続的な宅配便の運賃値上げは、急激に拡大を図っているネット通販の物流コストの上昇をもたらし当該ビジネスに大きな影響を与えており、それによってネット通販事業者の新たな対応が必要となっている」と指摘している（齊藤，2016，p.62）。</w:t>
-      </w:r>
-    </w:p>
-    <w:p>
-      <w:pPr>
-        <w:spacing w:lineRule="exact" w:line="360"/>
-        <w:ind w:firstLine="240"/>
-      </w:pPr>
-      <w:r>
-        <w:rPr>
-          <w:rFonts w:ascii="Century" w:hAnsi="Century" w:eastAsia="ＭＳ 明朝"/>
-          <w:b w:val="0"/>
-          <w:sz w:val="24"/>
-        </w:rPr>
-        <w:t>Amazonにおいても、「売上高に対する輸送コスト比率では2010年代初めに8％台であったものが上昇を続けており、2017年には12.2％に増加している」（齊藤，2021，p.53）。さらに、「2013年のクリスマスシーズンに急増したアマゾンのネット通販貨物に大手宅配便事業者のUPSが対応できず、アマゾンが販売した大量の商品がクリスマスまでに届かないという大規模な遅配が発生した」（齊藤，2022，pp.45-46）。</w:t>
+        <w:t>こうした中で、寡占化した大手宅配便事業者は運賃支配力を強め、運賃の値上げを継続的に行った（齊藤，2016，p.61）。UPSとFedExは、家庭配送追加料金や燃油追加料金などの追加料金を個別に値上げするとともに、2015年からは陸上宅配便にも、容積と重量を比較して運賃を決める容積重量価格を導入し、軽くてかさばるネット通販の貨物の運賃上昇をもたらした（齊藤，2016，pp.61-62）。このような継続的な運賃の値上げは、ネット通販事業者の物流コストを押し上げている（齊藤，2016，p.62）。Amazonにおいても、売上高に占める輸送コストの比率は2017年に12.2％に上昇した（齊藤，2021，p.53）。さらに2013年のクリスマスシーズンには、UPSが急増した貨物に対応できず、大規模な遅配が発生した（齊藤，2022，pp.45-46）。</w:t>
       </w:r>
     </w:p>
     <w:p>
@@ -195,7 +181,7 @@
           <w:b w:val="0"/>
           <w:sz w:val="24"/>
         </w:rPr>
-        <w:t>佐藤（1988，p.267）は、「新しい物流システムの一形態である宅配便が誕生した背景には，1970年代前半のいわゆるオイルショック以降におけるトラック輸送市場の変化がある」と述べ、トラック運送業が変革を迫られるなかで、「その一つが宅配便であり，ヤマト運輸（株）の『宅急便』が開発の先べんをつけた」としている。1976年にヤマト運輸が「宅急便」を開始した後（佐藤，1988，p.269）、「1977年に日本通運(株)と西濃運輸(株)，1981年には日本運送(株)や福山通運(株)など大手トラック企業が次々と宅配便市場へ参入した」（佐藤，1988，p.274）。</w:t>
+        <w:t>佐藤（1988，p.267）は、「新しい物流システムの一形態である宅配便が誕生した背景には，1970年代前半のいわゆるオイルショック以降におけるトラック輸送市場の変化がある」と述べている。産業構造の変化にともなって貨物が多品種少量化し、トラック運送業がそれまでのあり方の見直しを迫られるなかで生まれたのが宅配便であった（佐藤，1988，p.267）。1976年にヤマト運輸が「宅急便」を開始し（佐藤，1988，p.269）、その後、1977年には日本通運と西濃運輸、1981年には日本運送と福山通運などの大手トラック企業が相次いで宅配便市場に参入した（佐藤，1988，p.274）。</w:t>
       </w:r>
     </w:p>
     <w:p>
@@ -209,7 +195,7 @@
           <w:b w:val="0"/>
           <w:sz w:val="24"/>
         </w:rPr>
-        <w:t>宅急便は、取次店の制度によって出荷の利便性を高めた。取次店とは、「『宅急便』貨物の集荷所となる契約を結んだ一般の米屋とか酒屋，コンビニエンスストアなどのことである」（佐藤，1988，p.275）。そして、1985年の沖縄県進出によって全都道府県に進出し、1986年には島しょや北海道の一部を除いて全国的なネットワークを確立した（佐藤，1988，p.273）。その間、「『宅急便』の取扱個数は，1981年に鉄道小荷物を，そして1983年には郵便小包を上回り，その後も急増している」（佐藤，1988，p.277）。なお、佐藤（1988，p.268）によれば、「宅配便の定義に関しては，1983年に運輸省が認可した『宅配便運賃』によってその大枠が確定した」。</w:t>
+        <w:t>宅急便は、米屋や酒屋、コンビニエンスストアなどを取次店とする制度によって出荷の利便性を高め（佐藤，1988，p.275）、1986年には全国的なネットワークを確立した（佐藤，1988，p.273）。その取扱個数は、1981年に鉄道小荷物を、1983年には郵便小包を上回った（佐藤，1988，p.277）。また、佐藤（1988，p.268）は、「宅配便の定義に関しては，1983年に運輸省が認可した『宅配便運賃』によってその大枠が確定した」としている。</w:t>
       </w:r>
     </w:p>
     <w:p>
@@ -237,7 +223,7 @@
           <w:b w:val="0"/>
           <w:sz w:val="24"/>
         </w:rPr>
-        <w:t>国土交通省（2025）の添付資料によれば、宅配便の取扱個数は、1985年度の約4億9,300万個から増加を続けてきた。2024年度については、「令和６年度の宅配便取扱個数は、50億3147万個であった」（国土交通省，2025）。トラック運送による宅配便のシェアは、ヤマト運輸の「宅急便」が47.2％、佐川急便の「飛脚宅配便」が25.8％、日本郵便の「ゆうパック」が22.2％であり（国土交通省，2025）、「『宅急便』、『飛脚宅配便』及び『ゆうパック』の上位３便で約95.2%を占めている」（国土交通省，2025）。</w:t>
+        <w:t>国土交通省（2025）の添付資料によれば、宅配便の取扱個数は、1985年度の約4億9,300万個から増加を続け、2024年度には50億3,147万個に達した。2024年度のトラック運送による宅配便のシェアは、ヤマト運輸の「宅急便」が47.2％、佐川急便の「飛脚宅配便」が25.8％、日本郵便の「ゆうパック」が22.2％であり、上位3便で約95.2％を占めている（国土交通省，2025）。このように、日本の宅配便市場も少数の大手事業者による寡占構造となっている。</w:t>
       </w:r>
     </w:p>
     <w:p>
@@ -251,7 +237,7 @@
           <w:b w:val="0"/>
           <w:sz w:val="24"/>
         </w:rPr>
-        <w:t>このように、日本の宅配便市場も少数の大手事業者による寡占構造となっている。齊藤（2016，p.61）も、米国について「２社の大手宅配便事業者と郵便事業者の３社が市場の大部分を占めて寡占化しており、この点では宅配便の市場構造が日本と極めて類似している」と述べている。ただし同時に、「宅配便事業者の運賃支配力に関しては、日本と大きく異なっている」とも指摘している（齊藤，2016，p.61）。</w:t>
+        <w:t>齊藤（2016，p.61）は、米国について「２社の大手宅配便事業者と郵便事業者の３社が市場の大部分を占めて寡占化しており、この点では宅配便の市場構造が日本と極めて類似している」と述べる一方で、「宅配便事業者の運賃支配力に関しては、日本と大きく異なっている」と指摘している。</w:t>
       </w:r>
     </w:p>
     <w:p>
@@ -279,7 +265,7 @@
           <w:b w:val="0"/>
           <w:sz w:val="24"/>
         </w:rPr>
-        <w:t>日本では、2010年代に宅配危機が深刻化した。林（2020，p.9）は、「ネット通販の急成長によって宅配需要が急増する一方、働き方改革が必要とされ、2017年頃から宅配危機が深刻化した」と述べている。それに先立ち、「佐川急便は、2013年に取扱量拡大から収益性重視に転じ、採算性の低い大口ネット通販契約を見直した」（林，2020，pp.9-10）。さらに2017年には、ヤマト運輸が「ネット通販貨物向けの一部輸送サービスの停止や、輸送サービスそのものの供給を制限する総量規制を実施した」（齊藤，2022，p.56）。アマゾンジャパンとの関係では、「ヤマト運輸はアマゾンとも運賃交渉を行い、その結果40％もの運賃値上げが実施されることになった」（齊藤，2022，p.56）。</w:t>
+        <w:t>日本では、2010年代に宅配危機が深刻化した。林（2020，p.9）は、「ネット通販の急成長によって宅配需要が急増する一方、働き方改革が必要とされ、2017年頃から宅配危機が深刻化した」と述べている。それに先立つ2013年には、佐川急便が収益性重視へと方針を転換し、採算性の低い大口のネット通販契約を見直した（林，2020，pp.9-10）。2017年には、ドライバーが不足して十分な配送サービスを供給できなくなったヤマト運輸が、ネット通販貨物向けの一部輸送サービスの停止や総量規制を実施するとともに、アマゾンジャパンに対しても40％の運賃値上げを実施した（齊藤，2022，p.56）。</w:t>
       </w:r>
     </w:p>
     <w:p>

</xml_diff>

<commit_message>
Revise Sections 3.1-3.2: accuracy fixes, postal privatization, terminology
Co-Authored-By: Claude Opus 5.5 <noreply@anthropic.com>
Claude-Session: https://claude.ai/code/session_01D75XZCNXPUXwLshn5jBJpA
</commit_message>
<xml_diff>
--- a/thesis/第3章_3.1_3.2.docx
+++ b/thesis/第3章_3.1_3.2.docx
@@ -97,7 +97,7 @@
           <w:b w:val="0"/>
           <w:sz w:val="24"/>
         </w:rPr>
-        <w:t>市場構造をみると、2008年のリーマンショック後にDHLが米国内の宅配便から撤退して以降、寡占化が一段と進んだ（齊藤，2016，p.61）。2014年の大手3社の国内宅配便営業収入の構成比は、UPSが49％、FedExが32％、USPSが19％であり、民間の大手2社だけで約8割を占めている（齊藤，2016，p.61）。</w:t>
+        <w:t>市場構造をみると、2008年のリーマンショック後にDHLが米国内の宅配便から撤退して以降、寡占化が一段と進んだ（齊藤，2016，p.61）。2014年の大手3社の国内宅配便営業収入の構成比は、UPSが49％、FedExが32％、USPSが19％であり、地域運送事業者を除く大手3社のうち、民間の大手2社だけで約8割を占めている（齊藤，2016，p.61）。</w:t>
       </w:r>
     </w:p>
     <w:p>
@@ -125,7 +125,7 @@
           <w:b w:val="0"/>
           <w:sz w:val="24"/>
         </w:rPr>
-        <w:t>2010年代に入ると、ネット通販の急拡大を背景に宅配便市場は急速に拡大した。大手3社の国内宅配便の営業収入は、2010年の562億ドルから2014年には726億ドルに増加している（齊藤，2016，p.57）。UPSでは、ネット通販によるB2Cの宅配便が国内宅配便全体の45％を占めるに至った（齊藤，2016，p.58）。</w:t>
+        <w:t>2010年代に入ると、ネット通販の急拡大を背景に宅配便市場は急速に拡大した（齊藤，2016，pp.57-58）。大手3社の国内宅配便の営業収入は、2010年の562億ドルから2014年には726億ドルに増加している（齊藤，2016，p.57）。UPSでは、ネット通販によるB2Cの宅配便が国内宅配便全体の45％を占めるに至った（齊藤，2016，p.58）。</w:t>
       </w:r>
     </w:p>
     <w:p>
@@ -139,7 +139,7 @@
           <w:b w:val="0"/>
           <w:sz w:val="24"/>
         </w:rPr>
-        <w:t>こうした中で、寡占化した大手宅配便事業者は運賃支配力を強め、運賃の値上げを継続的に行った（齊藤，2016，p.61）。UPSとFedExは、家庭配送追加料金や燃油追加料金などの追加料金を個別に値上げするとともに、2015年からは陸上宅配便にも、容積と重量を比較して運賃を決める容積重量価格を導入し、軽くてかさばるネット通販の貨物の運賃上昇をもたらした（齊藤，2016，pp.61-62）。このような継続的な運賃の値上げは、ネット通販事業者の物流コストを押し上げている（齊藤，2016，p.62）。Amazonにおいても、売上高に占める輸送コストの比率は2017年に12.2％に上昇した（齊藤，2021，p.53）。さらに2013年のクリスマスシーズンには、UPSが急増した貨物に対応できず、大規模な遅配が発生した（齊藤，2022，pp.45-46）。</w:t>
+        <w:t>こうした中で、寡占化した大手宅配便事業者は運賃支配力を強め、運賃の値上げを継続的に行った（齊藤，2016，p.61）。UPSとFedExは、家庭配送追加料金や燃油追加料金などの追加料金を個別に値上げするとともに、2015年からは陸上宅配便にも、容積と重量を比較して運賃を決める容積重量価格を導入し、軽くてかさばるネット通販の貨物の運賃上昇をもたらした（齊藤，2016，pp.61-62）。このような継続的な運賃の値上げは、ネット通販事業者の物流コストを押し上げている（齊藤，2016，p.62）。一方で、大手宅配便事業者より運賃の安いUSPSや地域運送事業者の役割も高まっていた。Amazonは全米の郵便局のローカルネットワークを積極的に活用しているほか（齊藤，2016，p.60）、商品配送のうち地域運送事業者への委託割合は17％に達していた（齊藤，2016，p.61）。Amazonにおいても、売上高に占める輸送コストの比率は2017年に12.2％に上昇した（齊藤，2021，p.53）。さらに2013年のクリスマスシーズンには、UPSが急増した貨物に対応できず、大規模な遅配が発生した（齊藤，2022，pp.45-46）。</w:t>
       </w:r>
     </w:p>
     <w:p>
@@ -195,7 +195,7 @@
           <w:b w:val="0"/>
           <w:sz w:val="24"/>
         </w:rPr>
-        <w:t>宅急便は、米屋や酒屋、コンビニエンスストアなどを取次店とする制度によって出荷の利便性を高め（佐藤，1988，p.275）、1986年には全国的なネットワークを確立した（佐藤，1988，p.273）。その取扱個数は、1981年に鉄道小荷物を、1983年には郵便小包を上回った（佐藤，1988，p.277）。また、佐藤（1988，p.268）は、「宅配便の定義に関しては，1983年に運輸省が認可した『宅配便運賃』によってその大枠が確定した」としている。</w:t>
+        <w:t>宅急便は、米屋や酒屋、コンビニエンスストアなどを取次店とする制度によって出荷の利便性を高め（佐藤，1988，p.275）、1986年には島しょや北海道の一部を除いて全国的なネットワークを確立した（佐藤，1988，p.273）。その取扱個数は、1981年に鉄道小荷物を、1983年には郵便小包を上回った（佐藤，1988，p.277）。</w:t>
       </w:r>
     </w:p>
     <w:p>
@@ -223,7 +223,7 @@
           <w:b w:val="0"/>
           <w:sz w:val="24"/>
         </w:rPr>
-        <w:t>国土交通省（2025）の添付資料によれば、宅配便の取扱個数は、1985年度の約4億9,300万個から増加を続け、2024年度には50億3,147万個に達した。2024年度のトラック運送による宅配便のシェアは、ヤマト運輸の「宅急便」が47.2％、佐川急便の「飛脚宅配便」が25.8％、日本郵便の「ゆうパック」が22.2％であり、上位3便で約95.2％を占めている（国土交通省，2025）。このように、日本の宅配便市場も少数の大手事業者による寡占構造となっている。</w:t>
+        <w:t>その後、2007年10月の郵政民営化にともない、郵便事業株式会社（現在の日本郵便）が貨物自動車運送事業法等の適用を受けることとなり、同社の「ゆうパック」も宅配便の統計の対象となった（国土交通省，2025）。国土交通省（2025）の添付資料によれば、宅配便の取扱個数は、1985年度の約4億9,300万個から増加を続け、2024年度には50億3,147万個に達した。ただし、この間に「ゆうパック」が2007年度から、「ゆうパケット」が2016年10月から集計対象に加えられるなど、集計範囲が変更されている点には留意が必要である（国土交通省，2025）。2024年度のトラック運送による宅配便のシェアは、ヤマト運輸の「宅急便」が47.2％、佐川急便の「飛脚宅配便」が25.8％、日本郵便の「ゆうパック」が22.2％であり、上位3便で約95.2％を占めている（国土交通省，2025）。このように、日本の宅配便市場は、ヤマト運輸、佐川急便、日本郵便の3社を中心とする寡占構造となっている。</w:t>
       </w:r>
     </w:p>
     <w:p>
@@ -251,7 +251,7 @@
           <w:b/>
           <w:sz w:val="24"/>
         </w:rPr>
-        <w:t>3.2.3　宅配危機</w:t>
+        <w:t>3.2.3　宅配クライシス</w:t>
       </w:r>
     </w:p>
     <w:p>
@@ -265,7 +265,7 @@
           <w:b w:val="0"/>
           <w:sz w:val="24"/>
         </w:rPr>
-        <w:t>日本では、2010年代に宅配危機が深刻化した。林（2020，p.9）は、「ネット通販の急成長によって宅配需要が急増する一方、働き方改革が必要とされ、2017年頃から宅配危機が深刻化した」と述べている。それに先立つ2013年には、佐川急便が収益性重視へと方針を転換し、採算性の低い大口のネット通販契約を見直した（林，2020，pp.9-10）。2017年には、ドライバーが不足して十分な配送サービスを供給できなくなったヤマト運輸が、ネット通販貨物向けの一部輸送サービスの停止や総量規制を実施するとともに、アマゾンジャパンに対しても40％の運賃値上げを実施した（齊藤，2022，p.56）。</w:t>
+        <w:t>日本では、2010年代に宅配クライシス（宅配危機）が深刻化した。林（2020，p.9）は、「ネット通販の急成長によって宅配需要が急増する一方、働き方改革が必要とされ、2017年頃から宅配危機が深刻化した」と述べている。それに先立つ2013年には、佐川急便が収益性重視へと方針を転換し、採算性の低い大口のネット通販契約を見直した（林，2020，pp.9-10）。2017年には、ドライバーが不足して十分な配送サービスを供給できなくなったヤマト運輸が、ネット通販貨物向けの一部輸送サービスの停止や総量規制を実施し、アマゾンが実施していた当日配達も提供されなくなった。さらにヤマト運輸は、アマゾンジャパンに対しても40％の運賃値上げを実施した（齊藤，2022，p.56）。</w:t>
       </w:r>
     </w:p>
     <w:p>
@@ -279,7 +279,7 @@
           <w:b w:val="0"/>
           <w:sz w:val="24"/>
         </w:rPr>
-        <w:t>このように、日米の宅配市場は、少数の大手事業者による寡占構造という点で共通している。しかし、米国では寡占化した大手事業者による運賃支配力の強化が、日本ではドライバー不足や働き方改革を背景とする引受量の抑制と運賃の値上げが、それぞれネット通販事業者にとっての課題となったといえる。</w:t>
+        <w:t>このように、日米の宅配市場は、少数の大手事業者による寡占構造という点で共通している。しかし、米国では寡占化した大手事業者による運賃支配力の強化に加え、繁忙期の輸送能力の不足が、日本ではドライバー不足や働き方改革を背景とする引受量の抑制と運賃の値上げが、それぞれネット通販事業者にとっての課題となったといえる。</w:t>
       </w:r>
     </w:p>
     <w:sectPr>

</xml_diff>